<commit_message>
docs: volume de uploads e pendencia do antivirus
Manual de Deploy ganha a secao 6.5 (Volume de Uploads): como criar a montagem
no EasyPanel, por que o Dockerfile precisa do chown, e o que procurar no log
("Upload directory OK").

Fica registrado que o ClamAV nao esta no ambiente: nenhum anexo e verificado
contra virus hoje: a varredura devolve "indisponivel" e o arquivo entra
marcado como nao escaneado. Para ligar, basta subir o servico e apontar
CLAMAV_HOST — o codigo ja esta pronto.

.env.example: UPLOAD_DIR e FILE_URL_EXPIRES_SECONDS; MINIO_* marcadas como
nao utilizadas.

Co-Authored-By: Claude Opus 5 (1M context) <noreply@anthropic.com>
</commit_message>
<xml_diff>
--- a/Documentação/Manual_Deploy_HelpDesk_v1.docx
+++ b/Documentação/Manual_Deploy_HelpDesk_v1.docx
@@ -9614,6 +9614,149 @@
           <w:szCs w:val="20"/>
         </w:rPr>
         <w:t>Para conferir no log do container, procure por: 'Running Alembic migrations...' seguido das linhas 'Running upgrade' e 'Migrations complete.'</w:t>
+      </w:r>
+    </w:p>
+    <w:p>
+      <w:pPr>
+        <w:pStyle w:val="Heading2"/>
+        <w:spacing w:after="120" w:before="200"/>
+      </w:pPr>
+      <w:r>
+        <w:rPr>
+          <w:rFonts w:ascii="Arial" w:cs="Arial" w:eastAsia="Arial" w:hAnsi="Arial"/>
+          <w:b/>
+          <w:bCs/>
+          <w:color w:val="2E75B6"/>
+          <w:sz w:val="24"/>
+          <w:szCs w:val="24"/>
+        </w:rPr>
+        <w:t>6.5 Volume de Uploads (obrigatorio)</w:t>
+      </w:r>
+    </w:p>
+    <w:p>
+      <w:pPr>
+        <w:pStyle w:val="ListParagraph"/>
+        <w:numPr>
+          <w:ilvl w:val="0"/>
+          <w:numId w:val="2"/>
+        </w:numPr>
+        <w:spacing w:after="60"/>
+      </w:pPr>
+      <w:r>
+        <w:rPr>
+          <w:rFonts w:ascii="Arial" w:cs="Arial" w:eastAsia="Arial" w:hAnsi="Arial"/>
+          <w:sz w:val="20"/>
+          <w:szCs w:val="20"/>
+        </w:rPr>
+        <w:t>Anexos de chamado e fotos de perfil sao gravados em disco, no caminho definido por UPLOAD_DIR (padrao /app/uploads). Sem um volume montado nesse caminho, o Docker descarta os arquivos a cada redeploy e todos os anexos somem.</w:t>
+      </w:r>
+    </w:p>
+    <w:p>
+      <w:pPr>
+        <w:pStyle w:val="ListParagraph"/>
+        <w:numPr>
+          <w:ilvl w:val="0"/>
+          <w:numId w:val="2"/>
+        </w:numPr>
+        <w:spacing w:after="60"/>
+      </w:pPr>
+      <w:r>
+        <w:rPr>
+          <w:rFonts w:ascii="Arial" w:cs="Arial" w:eastAsia="Arial" w:hAnsi="Arial"/>
+          <w:sz w:val="20"/>
+          <w:szCs w:val="20"/>
+        </w:rPr>
+        <w:t>No EasyPanel: abra o servico helphs-api, va em Armazenamento e clique em 'Adicionar Montagem de Volume'. Informe um nome (por exemplo uploads) e o caminho no container: /app/uploads.</w:t>
+      </w:r>
+    </w:p>
+    <w:p>
+      <w:pPr>
+        <w:pStyle w:val="ListParagraph"/>
+        <w:numPr>
+          <w:ilvl w:val="0"/>
+          <w:numId w:val="2"/>
+        </w:numPr>
+        <w:spacing w:after="60"/>
+      </w:pPr>
+      <w:r>
+        <w:rPr>
+          <w:rFonts w:ascii="Arial" w:cs="Arial" w:eastAsia="Arial" w:hAnsi="Arial"/>
+          <w:sz w:val="20"/>
+          <w:szCs w:val="20"/>
+        </w:rPr>
+        <w:t>O Dockerfile ja cria /app/uploads pertencente ao usuario appuser antes de trocar de usuario. Isso e necessario porque o container nao roda como root: um volume montado sobre diretorio de root ficaria sem permissao de escrita e todo upload falharia.</w:t>
+      </w:r>
+    </w:p>
+    <w:p>
+      <w:pPr>
+        <w:pStyle w:val="ListParagraph"/>
+        <w:numPr>
+          <w:ilvl w:val="0"/>
+          <w:numId w:val="2"/>
+        </w:numPr>
+        <w:spacing w:after="60"/>
+      </w:pPr>
+      <w:r>
+        <w:rPr>
+          <w:rFonts w:ascii="Arial" w:cs="Arial" w:eastAsia="Arial" w:hAnsi="Arial"/>
+          <w:sz w:val="20"/>
+          <w:szCs w:val="20"/>
+        </w:rPr>
+        <w:t>Variaveis relacionadas: UPLOAD_DIR (caminho dos arquivos) e FILE_URL_EXPIRES_SECONDS (validade do link temporario de download, padrao 3600 segundos).</w:t>
+      </w:r>
+    </w:p>
+    <w:p>
+      <w:pPr>
+        <w:pStyle w:val="ListParagraph"/>
+        <w:numPr>
+          <w:ilvl w:val="0"/>
+          <w:numId w:val="2"/>
+        </w:numPr>
+        <w:spacing w:after="60"/>
+      </w:pPr>
+      <w:r>
+        <w:rPr>
+          <w:rFonts w:ascii="Arial" w:cs="Arial" w:eastAsia="Arial" w:hAnsi="Arial"/>
+          <w:sz w:val="20"/>
+          <w:szCs w:val="20"/>
+        </w:rPr>
+        <w:t>As variaveis MINIO_* nao sao mais usadas — o armazenamento em MinIO/S3 foi substituido por disco na v1.2.0. Elas seguem no .env.example apenas para nao quebrar ambientes antigos.</w:t>
+      </w:r>
+    </w:p>
+    <w:p>
+      <w:pPr>
+        <w:pStyle w:val="ListParagraph"/>
+        <w:numPr>
+          <w:ilvl w:val="0"/>
+          <w:numId w:val="2"/>
+        </w:numPr>
+        <w:spacing w:after="60"/>
+      </w:pPr>
+      <w:r>
+        <w:rPr>
+          <w:rFonts w:ascii="Arial" w:cs="Arial" w:eastAsia="Arial" w:hAnsi="Arial"/>
+          <w:sz w:val="20"/>
+          <w:szCs w:val="20"/>
+        </w:rPr>
+        <w:t>Como conferir: no log do container procure por 'Upload directory OK'. Se aparecer 'Upload directory unavailable', o volume nao esta montado ou esta sem permissao de escrita.</w:t>
+      </w:r>
+    </w:p>
+    <w:p>
+      <w:pPr>
+        <w:pStyle w:val="ListParagraph"/>
+        <w:numPr>
+          <w:ilvl w:val="0"/>
+          <w:numId w:val="2"/>
+        </w:numPr>
+        <w:spacing w:after="60"/>
+      </w:pPr>
+      <w:r>
+        <w:rPr>
+          <w:rFonts w:ascii="Arial" w:cs="Arial" w:eastAsia="Arial" w:hAnsi="Arial"/>
+          <w:sz w:val="20"/>
+          <w:szCs w:val="20"/>
+        </w:rPr>
+        <w:t>PENDENCIA: o antivirus ClamAV nao esta no ambiente. Os anexos sao aceitos sem varredura e ficam marcados como nao escaneados. Para ativar, suba um servico clamav/clamav:latest e configure CLAMAV_HOST e CLAMAV_PORT — o codigo ja esta pronto.</w:t>
       </w:r>
     </w:p>
     <w:p>

</xml_diff>